<commit_message>
Updated DOCX and PDF
</commit_message>
<xml_diff>
--- a/Les-1/C practicum les 1.docx
+++ b/Les-1/C practicum les 1.docx
@@ -4443,7 +4443,7 @@
 <w:ftr xmlns:wpc="http://schemas.microsoft.com/office/word/2010/wordprocessingCanvas" xmlns:mc="http://schemas.openxmlformats.org/markup-compatibility/2006" xmlns:o="urn:schemas-microsoft-com:office:office" xmlns:r="http://schemas.openxmlformats.org/officeDocument/2006/relationships" xmlns:m="http://schemas.openxmlformats.org/officeDocument/2006/math" xmlns:v="urn:schemas-microsoft-com:vml" xmlns:wp14="http://schemas.microsoft.com/office/word/2010/wordprocessingDrawing" xmlns:wp="http://schemas.openxmlformats.org/drawingml/2006/wordprocessingDrawing" xmlns:w10="urn:schemas-microsoft-com:office:word" xmlns:w="http://schemas.openxmlformats.org/wordprocessingml/2006/main" xmlns:w14="http://schemas.microsoft.com/office/word/2010/wordml" xmlns:w15="http://schemas.microsoft.com/office/word/2012/wordml" xmlns:wpg="http://schemas.microsoft.com/office/word/2010/wordprocessingGroup" xmlns:wpi="http://schemas.microsoft.com/office/word/2010/wordprocessingInk" xmlns:wne="http://schemas.microsoft.com/office/word/2006/wordml" xmlns:a="http://schemas.openxmlformats.org/drawingml/2006/main" xmlns:wps="http://schemas.microsoft.com/office/word/2010/wordprocessingShape" mc:Ignorable="w14 w15 wp14">
   <w:p>
     <w:pPr>
-      <w:pStyle w:val="44"/>
+      <w:pStyle w:val="178"/>
       <w:pBdr/>
       <w:spacing/>
       <w:ind/>
@@ -4454,6 +4454,8 @@
         <w:lang w:val="en-GB"/>
       </w:rPr>
       <w:t xml:space="preserve">Author: Tom Steenvoorden</w:t>
+      <w:br/>
+      <w:t xml:space="preserve">Date: 23-02-2026</w:t>
     </w:r>
     <w:r/>
   </w:p>

</xml_diff>